<commit_message>
OCR: add Updated Recommendations and Agencies sections
- Add section 7 (Updated Recommendations or Best Practices) and
  section 8 (Agencies Directly Using JupiterOne GovCloud) to the .docx
- Populate updatedRecommendations in the .json example
- Align KSI-IAM-APM example status with the SDR (On Track)

Co-Authored-By: Claude Opus 5.5 <noreply@anthropic.com>
Claude-Session: https://claude.ai/code/session_01QqdRwbgxpbgZLeo3nnYUym
</commit_message>
<xml_diff>
--- a/JupiterOne_Example_Ongoing_Certification_Report.docx
+++ b/JupiterOne_Example_Ongoing_Certification_Report.docx
@@ -2454,31 +2454,31 @@
                 <w:szCs w:val="20"/>
                 <w:rtl w:val="0"/>
               </w:rPr>
-              <w:t xml:space="preserve">[In Progress]</w:t>
-            </w:r>
-            <w:r>
-              <w:rPr>
-                <w:rtl w:val="0"/>
-              </w:rPr>
-            </w:r>
-          </w:p>
-        </w:tc>
-        <w:tc>
-          <w:tcPr/>
-          <w:p>
-            <w:pPr>
-              <w:rPr/>
-            </w:pPr>
-            <w:r>
-              <w:rPr>
-                <w:b w:val="0"/>
-                <w:bCs w:val="0"/>
-                <w:color w:val="000000"/>
-                <w:sz w:val="20"/>
-                <w:szCs w:val="20"/>
-                <w:rtl w:val="0"/>
-              </w:rPr>
-              <w:t xml:space="preserve">[remediation status]</w:t>
+              <w:t xml:space="preserve">[On Track]</w:t>
+            </w:r>
+            <w:r>
+              <w:rPr>
+                <w:rtl w:val="0"/>
+              </w:rPr>
+            </w:r>
+          </w:p>
+        </w:tc>
+        <w:tc>
+          <w:tcPr/>
+          <w:p>
+            <w:pPr>
+              <w:rPr/>
+            </w:pPr>
+            <w:r>
+              <w:rPr>
+                <w:b w:val="0"/>
+                <w:bCs w:val="0"/>
+                <w:color w:val="000000"/>
+                <w:sz w:val="20"/>
+                <w:szCs w:val="20"/>
+                <w:rtl w:val="0"/>
+              </w:rPr>
+              <w:t xml:space="preserve">[brief note]</w:t>
             </w:r>
             <w:r>
               <w:rPr>
@@ -2655,7 +2655,81 @@
         <w:rPr>
           <w:rtl w:val="0"/>
         </w:rPr>
-        <w:t xml:space="preserve">7. Next Ongoing Certification Report</w:t>
+        <w:t xml:space="preserve">7. Updated Recommendations or Best Practices</w:t>
+      </w:r>
+    </w:p>
+    <w:p>
+      <w:pPr>
+        <w:spacing w:after="150" w:lineRule="auto"/>
+        <w:rPr/>
+      </w:pPr>
+      <w:r>
+        <w:rPr>
+          <w:rtl w:val="0"/>
+        </w:rPr>
+        <w:t xml:space="preserve">Changes during the reporting period to JupiterOne's recommendations or best practices for securely configuring and using JupiterOne GovCloud, including updates to the Secure Configuration Guidance (SCG-CSO-RSC).</w:t>
+      </w:r>
+    </w:p>
+    <w:p>
+      <w:pPr>
+        <w:spacing w:after="150" w:lineRule="auto"/>
+        <w:rPr/>
+      </w:pPr>
+      <w:r>
+        <w:rPr>
+          <w:rtl w:val="0"/>
+        </w:rPr>
+        <w:t xml:space="preserve">[Example: Updated the Secure Configuration Guidance to recommend enforcing phishing-resistant authentication (FIDO2/WebAuthn) at the customer's identity provider for all JupiterOne GovCloud users. / No updated recommendations or best practices were issued during this period.]</w:t>
+      </w:r>
+    </w:p>
+    <w:p>
+      <w:pPr>
+        <w:pStyle w:val="Heading1"/>
+        <w:spacing w:after="200" w:before="300" w:lineRule="auto"/>
+        <w:rPr/>
+      </w:pPr>
+      <w:r>
+        <w:rPr>
+          <w:rtl w:val="0"/>
+        </w:rPr>
+        <w:t xml:space="preserve">8. Agencies Directly Using JupiterOne GovCloud</w:t>
+      </w:r>
+    </w:p>
+    <w:p>
+      <w:pPr>
+        <w:spacing w:after="150" w:lineRule="auto"/>
+        <w:rPr/>
+      </w:pPr>
+      <w:r>
+        <w:rPr>
+          <w:rtl w:val="0"/>
+        </w:rPr>
+        <w:t xml:space="preserve">List of all federal agencies directly using JupiterOne GovCloud as of the end of the reporting period.</w:t>
+      </w:r>
+    </w:p>
+    <w:p>
+      <w:pPr>
+        <w:spacing w:after="150" w:lineRule="auto"/>
+        <w:rPr/>
+      </w:pPr>
+      <w:r>
+        <w:rPr>
+          <w:rtl w:val="0"/>
+        </w:rPr>
+        <w:t xml:space="preserve">[Example: Agency name(s). / None — no federal agencies were directly using JupiterOne GovCloud as of the end of this period.]</w:t>
+      </w:r>
+    </w:p>
+    <w:p>
+      <w:pPr>
+        <w:pStyle w:val="Heading1"/>
+        <w:spacing w:after="200" w:before="300" w:lineRule="auto"/>
+        <w:rPr/>
+      </w:pPr>
+      <w:r>
+        <w:rPr>
+          <w:rtl w:val="0"/>
+        </w:rPr>
+        <w:t xml:space="preserve">9. Next Ongoing Certification Report</w:t>
       </w:r>
     </w:p>
     <w:p>

</xml_diff>